<commit_message>
Refine collaborator report and PLM-Sol rationale
</commit_message>
<xml_diff>
--- a/docs/result_artifacts/weekly_report_result/report_2026_W34_nb252_expression_route/Nb252_predictor_and_selection_guide.docx
+++ b/docs/result_artifacts/weekly_report_result/report_2026_W34_nb252_expression_route/Nb252_predictor_and_selection_guide.docx
@@ -9,7 +9,7 @@
       </w:pPr>
       <w:r>
         <w:rPr>
-          <w:rFonts w:ascii="Microsoft YaHei" w:hAnsi="Microsoft YaHei" w:eastAsia="Microsoft YaHei"/>
+          <w:rFonts w:ascii="Microsoft YaHei" w:hAnsi="Microsoft YaHei" w:eastAsia="Microsoft YaHei" w:cs="Microsoft YaHei"/>
           <w:b/>
           <w:color w:val="000000"/>
           <w:sz w:val="42"/>
@@ -24,7 +24,7 @@
       </w:pPr>
       <w:r>
         <w:rPr>
-          <w:rFonts w:ascii="Microsoft YaHei" w:hAnsi="Microsoft YaHei" w:eastAsia="Microsoft YaHei"/>
+          <w:rFonts w:ascii="Microsoft YaHei" w:hAnsi="Microsoft YaHei" w:eastAsia="Microsoft YaHei" w:cs="Microsoft YaHei"/>
           <w:color w:val="000000"/>
           <w:sz w:val="23"/>
         </w:rPr>
@@ -33,31 +33,53 @@
     </w:p>
     <w:tbl>
       <w:tblPr>
-        <w:tblW w:type="auto" w:w="0"/>
+        <w:tblW w:type="dxa" w:w="9858"/>
         <w:jc w:val="center"/>
         <w:tblLayout w:type="fixed"/>
         <w:tblLook w:firstColumn="1" w:firstRow="1" w:lastColumn="0" w:lastRow="0" w:noHBand="0" w:noVBand="1" w:val="04A0"/>
+        <w:tblInd w:w="0" w:type="dxa"/>
+        <w:tblBorders>
+          <w:top w:val="single" w:sz="12" w:space="0" w:color="000000"/>
+          <w:bottom w:val="single" w:sz="12" w:space="0" w:color="000000"/>
+          <w:left w:val="nil" w:sz="0" w:space="0" w:color="000000"/>
+          <w:right w:val="nil" w:sz="0" w:space="0" w:color="000000"/>
+          <w:insideH w:val="nil" w:sz="0" w:space="0" w:color="000000"/>
+          <w:insideV w:val="nil" w:sz="0" w:space="0" w:color="000000"/>
+        </w:tblBorders>
       </w:tblPr>
       <w:tblGrid>
-        <w:gridCol w:w="3286"/>
-        <w:gridCol w:w="3286"/>
-        <w:gridCol w:w="3286"/>
+        <w:gridCol w:w="1631"/>
+        <w:gridCol w:w="1631"/>
+        <w:gridCol w:w="6596"/>
       </w:tblGrid>
       <w:tr>
         <w:tc>
           <w:tcPr>
-            <w:tcW w:type="dxa" w:w="1584"/>
+            <w:tcW w:type="dxa" w:w="1631"/>
             <w:vAlign w:val="center"/>
-            <w:shd w:fill="E8E8E8"/>
+            <w:tcMar>
+              <w:top w:w="55" w:type="dxa"/>
+              <w:bottom w:w="55" w:type="dxa"/>
+              <w:start w:w="85" w:type="dxa"/>
+              <w:end w:w="85" w:type="dxa"/>
+            </w:tcMar>
+            <w:tcBorders>
+              <w:bottom w:val="single" w:sz="8" w:space="0" w:color="000000"/>
+            </w:tcBorders>
           </w:tcPr>
           <w:p>
             <w:pPr>
-              <w:spacing w:after="0"/>
+              <w:spacing w:after="0" w:line="252" w:lineRule="auto"/>
             </w:pPr>
-            <w:r/>
             <w:r>
               <w:rPr>
-                <w:rFonts w:ascii="Microsoft YaHei" w:hAnsi="Microsoft YaHei" w:eastAsia="Microsoft YaHei"/>
+                <w:rFonts w:ascii="Microsoft YaHei" w:hAnsi="Microsoft YaHei" w:eastAsia="Microsoft YaHei" w:cs="Microsoft YaHei"/>
+                <w:color w:val="000000"/>
+              </w:rPr>
+            </w:r>
+            <w:r>
+              <w:rPr>
+                <w:rFonts w:ascii="Microsoft YaHei" w:hAnsi="Microsoft YaHei" w:eastAsia="Microsoft YaHei" w:cs="Microsoft YaHei"/>
                 <w:b/>
                 <w:color w:val="000000"/>
                 <w:sz w:val="16"/>
@@ -68,18 +90,31 @@
         </w:tc>
         <w:tc>
           <w:tcPr>
-            <w:tcW w:type="dxa" w:w="1584"/>
+            <w:tcW w:type="dxa" w:w="1631"/>
             <w:vAlign w:val="center"/>
-            <w:shd w:fill="E8E8E8"/>
+            <w:tcMar>
+              <w:top w:w="55" w:type="dxa"/>
+              <w:bottom w:w="55" w:type="dxa"/>
+              <w:start w:w="85" w:type="dxa"/>
+              <w:end w:w="85" w:type="dxa"/>
+            </w:tcMar>
+            <w:tcBorders>
+              <w:bottom w:val="single" w:sz="8" w:space="0" w:color="000000"/>
+            </w:tcBorders>
           </w:tcPr>
           <w:p>
             <w:pPr>
-              <w:spacing w:after="0"/>
+              <w:spacing w:after="0" w:line="252" w:lineRule="auto"/>
             </w:pPr>
-            <w:r/>
             <w:r>
               <w:rPr>
-                <w:rFonts w:ascii="Microsoft YaHei" w:hAnsi="Microsoft YaHei" w:eastAsia="Microsoft YaHei"/>
+                <w:rFonts w:ascii="Microsoft YaHei" w:hAnsi="Microsoft YaHei" w:eastAsia="Microsoft YaHei" w:cs="Microsoft YaHei"/>
+                <w:color w:val="000000"/>
+              </w:rPr>
+            </w:r>
+            <w:r>
+              <w:rPr>
+                <w:rFonts w:ascii="Microsoft YaHei" w:hAnsi="Microsoft YaHei" w:eastAsia="Microsoft YaHei" w:cs="Microsoft YaHei"/>
                 <w:b/>
                 <w:color w:val="000000"/>
                 <w:sz w:val="16"/>
@@ -90,18 +125,31 @@
         </w:tc>
         <w:tc>
           <w:tcPr>
-            <w:tcW w:type="dxa" w:w="6408"/>
+            <w:tcW w:type="dxa" w:w="6596"/>
             <w:vAlign w:val="center"/>
-            <w:shd w:fill="E8E8E8"/>
+            <w:tcMar>
+              <w:top w:w="55" w:type="dxa"/>
+              <w:bottom w:w="55" w:type="dxa"/>
+              <w:start w:w="85" w:type="dxa"/>
+              <w:end w:w="85" w:type="dxa"/>
+            </w:tcMar>
+            <w:tcBorders>
+              <w:bottom w:val="single" w:sz="8" w:space="0" w:color="000000"/>
+            </w:tcBorders>
           </w:tcPr>
           <w:p>
             <w:pPr>
-              <w:spacing w:after="0"/>
+              <w:spacing w:after="0" w:line="252" w:lineRule="auto"/>
             </w:pPr>
-            <w:r/>
             <w:r>
               <w:rPr>
-                <w:rFonts w:ascii="Microsoft YaHei" w:hAnsi="Microsoft YaHei" w:eastAsia="Microsoft YaHei"/>
+                <w:rFonts w:ascii="Microsoft YaHei" w:hAnsi="Microsoft YaHei" w:eastAsia="Microsoft YaHei" w:cs="Microsoft YaHei"/>
+                <w:color w:val="000000"/>
+              </w:rPr>
+            </w:r>
+            <w:r>
+              <w:rPr>
+                <w:rFonts w:ascii="Microsoft YaHei" w:hAnsi="Microsoft YaHei" w:eastAsia="Microsoft YaHei" w:cs="Microsoft YaHei"/>
                 <w:b/>
                 <w:color w:val="000000"/>
                 <w:sz w:val="16"/>
@@ -114,17 +162,28 @@
       <w:tr>
         <w:tc>
           <w:tcPr>
-            <w:tcW w:type="dxa" w:w="1584"/>
+            <w:tcW w:type="dxa" w:w="1631"/>
             <w:vAlign w:val="center"/>
+            <w:tcMar>
+              <w:top w:w="55" w:type="dxa"/>
+              <w:bottom w:w="55" w:type="dxa"/>
+              <w:start w:w="85" w:type="dxa"/>
+              <w:end w:w="85" w:type="dxa"/>
+            </w:tcMar>
           </w:tcPr>
           <w:p>
             <w:pPr>
-              <w:spacing w:after="0"/>
+              <w:spacing w:after="0" w:line="252" w:lineRule="auto"/>
             </w:pPr>
-            <w:r/>
             <w:r>
               <w:rPr>
-                <w:rFonts w:ascii="Microsoft YaHei" w:hAnsi="Microsoft YaHei" w:eastAsia="Microsoft YaHei"/>
+                <w:rFonts w:ascii="Microsoft YaHei" w:hAnsi="Microsoft YaHei" w:eastAsia="Microsoft YaHei" w:cs="Microsoft YaHei"/>
+                <w:color w:val="000000"/>
+              </w:rPr>
+            </w:r>
+            <w:r>
+              <w:rPr>
+                <w:rFonts w:ascii="Microsoft YaHei" w:hAnsi="Microsoft YaHei" w:eastAsia="Microsoft YaHei" w:cs="Microsoft YaHei"/>
                 <w:b w:val="0"/>
                 <w:color w:val="000000"/>
                 <w:sz w:val="16"/>
@@ -135,17 +194,28 @@
         </w:tc>
         <w:tc>
           <w:tcPr>
-            <w:tcW w:type="dxa" w:w="1584"/>
+            <w:tcW w:type="dxa" w:w="1631"/>
             <w:vAlign w:val="center"/>
+            <w:tcMar>
+              <w:top w:w="55" w:type="dxa"/>
+              <w:bottom w:w="55" w:type="dxa"/>
+              <w:start w:w="85" w:type="dxa"/>
+              <w:end w:w="85" w:type="dxa"/>
+            </w:tcMar>
           </w:tcPr>
           <w:p>
             <w:pPr>
-              <w:spacing w:after="0"/>
+              <w:spacing w:after="0" w:line="252" w:lineRule="auto"/>
             </w:pPr>
-            <w:r/>
             <w:r>
               <w:rPr>
-                <w:rFonts w:ascii="Microsoft YaHei" w:hAnsi="Microsoft YaHei" w:eastAsia="Microsoft YaHei"/>
+                <w:rFonts w:ascii="Microsoft YaHei" w:hAnsi="Microsoft YaHei" w:eastAsia="Microsoft YaHei" w:cs="Microsoft YaHei"/>
+                <w:color w:val="000000"/>
+              </w:rPr>
+            </w:r>
+            <w:r>
+              <w:rPr>
+                <w:rFonts w:ascii="Microsoft YaHei" w:hAnsi="Microsoft YaHei" w:eastAsia="Microsoft YaHei" w:cs="Microsoft YaHei"/>
                 <w:b w:val="0"/>
                 <w:color w:val="000000"/>
                 <w:sz w:val="16"/>
@@ -156,22 +226,33 @@
         </w:tc>
         <w:tc>
           <w:tcPr>
-            <w:tcW w:type="dxa" w:w="6408"/>
+            <w:tcW w:type="dxa" w:w="6596"/>
             <w:vAlign w:val="center"/>
+            <w:tcMar>
+              <w:top w:w="55" w:type="dxa"/>
+              <w:bottom w:w="55" w:type="dxa"/>
+              <w:start w:w="85" w:type="dxa"/>
+              <w:end w:w="85" w:type="dxa"/>
+            </w:tcMar>
           </w:tcPr>
           <w:p>
             <w:pPr>
-              <w:spacing w:after="0"/>
+              <w:spacing w:after="0" w:line="252" w:lineRule="auto"/>
             </w:pPr>
-            <w:r/>
             <w:r>
               <w:rPr>
-                <w:rFonts w:ascii="Microsoft YaHei" w:hAnsi="Microsoft YaHei" w:eastAsia="Microsoft YaHei"/>
+                <w:rFonts w:ascii="Microsoft YaHei" w:hAnsi="Microsoft YaHei" w:eastAsia="Microsoft YaHei" w:cs="Microsoft YaHei"/>
+                <w:color w:val="000000"/>
+              </w:rPr>
+            </w:r>
+            <w:r>
+              <w:rPr>
+                <w:rFonts w:ascii="Microsoft YaHei" w:hAnsi="Microsoft YaHei" w:eastAsia="Microsoft YaHei" w:cs="Microsoft YaHei"/>
                 <w:b w:val="0"/>
                 <w:color w:val="000000"/>
                 <w:sz w:val="16"/>
               </w:rPr>
-              <w:t>0–1的usability模型输出；与S同属一个工具家族，不双重计票</w:t>
+              <w:t>0–1的综合可用性模型输出；与S同属一个工具家族，不双重计票</w:t>
             </w:r>
           </w:p>
         </w:tc>
@@ -179,17 +260,28 @@
       <w:tr>
         <w:tc>
           <w:tcPr>
-            <w:tcW w:type="dxa" w:w="1584"/>
+            <w:tcW w:type="dxa" w:w="1631"/>
             <w:vAlign w:val="center"/>
+            <w:tcMar>
+              <w:top w:w="55" w:type="dxa"/>
+              <w:bottom w:w="55" w:type="dxa"/>
+              <w:start w:w="85" w:type="dxa"/>
+              <w:end w:w="85" w:type="dxa"/>
+            </w:tcMar>
           </w:tcPr>
           <w:p>
             <w:pPr>
-              <w:spacing w:after="0"/>
+              <w:spacing w:after="0" w:line="252" w:lineRule="auto"/>
             </w:pPr>
-            <w:r/>
             <w:r>
               <w:rPr>
-                <w:rFonts w:ascii="Microsoft YaHei" w:hAnsi="Microsoft YaHei" w:eastAsia="Microsoft YaHei"/>
+                <w:rFonts w:ascii="Microsoft YaHei" w:hAnsi="Microsoft YaHei" w:eastAsia="Microsoft YaHei" w:cs="Microsoft YaHei"/>
+                <w:color w:val="000000"/>
+              </w:rPr>
+            </w:r>
+            <w:r>
+              <w:rPr>
+                <w:rFonts w:ascii="Microsoft YaHei" w:hAnsi="Microsoft YaHei" w:eastAsia="Microsoft YaHei" w:cs="Microsoft YaHei"/>
                 <w:b w:val="0"/>
                 <w:color w:val="000000"/>
                 <w:sz w:val="16"/>
@@ -200,17 +292,28 @@
         </w:tc>
         <w:tc>
           <w:tcPr>
-            <w:tcW w:type="dxa" w:w="1584"/>
+            <w:tcW w:type="dxa" w:w="1631"/>
             <w:vAlign w:val="center"/>
+            <w:tcMar>
+              <w:top w:w="55" w:type="dxa"/>
+              <w:bottom w:w="55" w:type="dxa"/>
+              <w:start w:w="85" w:type="dxa"/>
+              <w:end w:w="85" w:type="dxa"/>
+            </w:tcMar>
           </w:tcPr>
           <w:p>
             <w:pPr>
-              <w:spacing w:after="0"/>
+              <w:spacing w:after="0" w:line="252" w:lineRule="auto"/>
             </w:pPr>
-            <w:r/>
             <w:r>
               <w:rPr>
-                <w:rFonts w:ascii="Microsoft YaHei" w:hAnsi="Microsoft YaHei" w:eastAsia="Microsoft YaHei"/>
+                <w:rFonts w:ascii="Microsoft YaHei" w:hAnsi="Microsoft YaHei" w:eastAsia="Microsoft YaHei" w:cs="Microsoft YaHei"/>
+                <w:color w:val="000000"/>
+              </w:rPr>
+            </w:r>
+            <w:r>
+              <w:rPr>
+                <w:rFonts w:ascii="Microsoft YaHei" w:hAnsi="Microsoft YaHei" w:eastAsia="Microsoft YaHei" w:cs="Microsoft YaHei"/>
                 <w:b w:val="0"/>
                 <w:color w:val="000000"/>
                 <w:sz w:val="16"/>
@@ -221,22 +324,33 @@
         </w:tc>
         <w:tc>
           <w:tcPr>
-            <w:tcW w:type="dxa" w:w="6408"/>
+            <w:tcW w:type="dxa" w:w="6596"/>
             <w:vAlign w:val="center"/>
+            <w:tcMar>
+              <w:top w:w="55" w:type="dxa"/>
+              <w:bottom w:w="55" w:type="dxa"/>
+              <w:start w:w="85" w:type="dxa"/>
+              <w:end w:w="85" w:type="dxa"/>
+            </w:tcMar>
           </w:tcPr>
           <w:p>
             <w:pPr>
-              <w:spacing w:after="0"/>
+              <w:spacing w:after="0" w:line="252" w:lineRule="auto"/>
             </w:pPr>
-            <w:r/>
             <w:r>
               <w:rPr>
-                <w:rFonts w:ascii="Microsoft YaHei" w:hAnsi="Microsoft YaHei" w:eastAsia="Microsoft YaHei"/>
+                <w:rFonts w:ascii="Microsoft YaHei" w:hAnsi="Microsoft YaHei" w:eastAsia="Microsoft YaHei" w:cs="Microsoft YaHei"/>
+                <w:color w:val="000000"/>
+              </w:rPr>
+            </w:r>
+            <w:r>
+              <w:rPr>
+                <w:rFonts w:ascii="Microsoft YaHei" w:hAnsi="Microsoft YaHei" w:eastAsia="Microsoft YaHei" w:cs="Microsoft YaHei"/>
                 <w:b w:val="0"/>
                 <w:color w:val="000000"/>
                 <w:sz w:val="16"/>
               </w:rPr>
-              <w:t>预测solubility；与BL21产量仅有限相关，是软偏好</w:t>
+              <w:t>预测可溶性得分；PLM_Sol分层相关虽较高，但簇外验证不优且无独立增量，故保留NetSolP作为同类代表</w:t>
             </w:r>
           </w:p>
         </w:tc>
@@ -244,17 +358,28 @@
       <w:tr>
         <w:tc>
           <w:tcPr>
-            <w:tcW w:type="dxa" w:w="1584"/>
+            <w:tcW w:type="dxa" w:w="1631"/>
             <w:vAlign w:val="center"/>
+            <w:tcMar>
+              <w:top w:w="55" w:type="dxa"/>
+              <w:bottom w:w="55" w:type="dxa"/>
+              <w:start w:w="85" w:type="dxa"/>
+              <w:end w:w="85" w:type="dxa"/>
+            </w:tcMar>
           </w:tcPr>
           <w:p>
             <w:pPr>
-              <w:spacing w:after="0"/>
+              <w:spacing w:after="0" w:line="252" w:lineRule="auto"/>
             </w:pPr>
-            <w:r/>
             <w:r>
               <w:rPr>
-                <w:rFonts w:ascii="Microsoft YaHei" w:hAnsi="Microsoft YaHei" w:eastAsia="Microsoft YaHei"/>
+                <w:rFonts w:ascii="Microsoft YaHei" w:hAnsi="Microsoft YaHei" w:eastAsia="Microsoft YaHei" w:cs="Microsoft YaHei"/>
+                <w:color w:val="000000"/>
+              </w:rPr>
+            </w:r>
+            <w:r>
+              <w:rPr>
+                <w:rFonts w:ascii="Microsoft YaHei" w:hAnsi="Microsoft YaHei" w:eastAsia="Microsoft YaHei" w:cs="Microsoft YaHei"/>
                 <w:b w:val="0"/>
                 <w:color w:val="000000"/>
                 <w:sz w:val="16"/>
@@ -265,17 +390,28 @@
         </w:tc>
         <w:tc>
           <w:tcPr>
-            <w:tcW w:type="dxa" w:w="1584"/>
+            <w:tcW w:type="dxa" w:w="1631"/>
             <w:vAlign w:val="center"/>
+            <w:tcMar>
+              <w:top w:w="55" w:type="dxa"/>
+              <w:bottom w:w="55" w:type="dxa"/>
+              <w:start w:w="85" w:type="dxa"/>
+              <w:end w:w="85" w:type="dxa"/>
+            </w:tcMar>
           </w:tcPr>
           <w:p>
             <w:pPr>
-              <w:spacing w:after="0"/>
+              <w:spacing w:after="0" w:line="252" w:lineRule="auto"/>
             </w:pPr>
-            <w:r/>
             <w:r>
               <w:rPr>
-                <w:rFonts w:ascii="Microsoft YaHei" w:hAnsi="Microsoft YaHei" w:eastAsia="Microsoft YaHei"/>
+                <w:rFonts w:ascii="Microsoft YaHei" w:hAnsi="Microsoft YaHei" w:eastAsia="Microsoft YaHei" w:cs="Microsoft YaHei"/>
+                <w:color w:val="000000"/>
+              </w:rPr>
+            </w:r>
+            <w:r>
+              <w:rPr>
+                <w:rFonts w:ascii="Microsoft YaHei" w:hAnsi="Microsoft YaHei" w:eastAsia="Microsoft YaHei" w:cs="Microsoft YaHei"/>
                 <w:b w:val="0"/>
                 <w:color w:val="000000"/>
                 <w:sz w:val="16"/>
@@ -286,17 +422,28 @@
         </w:tc>
         <w:tc>
           <w:tcPr>
-            <w:tcW w:type="dxa" w:w="6408"/>
+            <w:tcW w:type="dxa" w:w="6596"/>
             <w:vAlign w:val="center"/>
+            <w:tcMar>
+              <w:top w:w="55" w:type="dxa"/>
+              <w:bottom w:w="55" w:type="dxa"/>
+              <w:start w:w="85" w:type="dxa"/>
+              <w:end w:w="85" w:type="dxa"/>
+            </w:tcMar>
           </w:tcPr>
           <w:p>
             <w:pPr>
-              <w:spacing w:after="0"/>
+              <w:spacing w:after="0" w:line="252" w:lineRule="auto"/>
             </w:pPr>
-            <w:r/>
             <w:r>
               <w:rPr>
-                <w:rFonts w:ascii="Microsoft YaHei" w:hAnsi="Microsoft YaHei" w:eastAsia="Microsoft YaHei"/>
+                <w:rFonts w:ascii="Microsoft YaHei" w:hAnsi="Microsoft YaHei" w:eastAsia="Microsoft YaHei" w:cs="Microsoft YaHei"/>
+                <w:color w:val="000000"/>
+              </w:rPr>
+            </w:r>
+            <w:r>
+              <w:rPr>
+                <w:rFonts w:ascii="Microsoft YaHei" w:hAnsi="Microsoft YaHei" w:eastAsia="Microsoft YaHei" w:cs="Microsoft YaHei"/>
                 <w:b w:val="0"/>
                 <w:color w:val="000000"/>
                 <w:sz w:val="16"/>
@@ -309,17 +456,28 @@
       <w:tr>
         <w:tc>
           <w:tcPr>
-            <w:tcW w:type="dxa" w:w="1584"/>
+            <w:tcW w:type="dxa" w:w="1631"/>
             <w:vAlign w:val="center"/>
+            <w:tcMar>
+              <w:top w:w="55" w:type="dxa"/>
+              <w:bottom w:w="55" w:type="dxa"/>
+              <w:start w:w="85" w:type="dxa"/>
+              <w:end w:w="85" w:type="dxa"/>
+            </w:tcMar>
           </w:tcPr>
           <w:p>
             <w:pPr>
-              <w:spacing w:after="0"/>
+              <w:spacing w:after="0" w:line="252" w:lineRule="auto"/>
             </w:pPr>
-            <w:r/>
             <w:r>
               <w:rPr>
-                <w:rFonts w:ascii="Microsoft YaHei" w:hAnsi="Microsoft YaHei" w:eastAsia="Microsoft YaHei"/>
+                <w:rFonts w:ascii="Microsoft YaHei" w:hAnsi="Microsoft YaHei" w:eastAsia="Microsoft YaHei" w:cs="Microsoft YaHei"/>
+                <w:color w:val="000000"/>
+              </w:rPr>
+            </w:r>
+            <w:r>
+              <w:rPr>
+                <w:rFonts w:ascii="Microsoft YaHei" w:hAnsi="Microsoft YaHei" w:eastAsia="Microsoft YaHei" w:cs="Microsoft YaHei"/>
                 <w:b w:val="0"/>
                 <w:color w:val="000000"/>
                 <w:sz w:val="16"/>
@@ -330,17 +488,28 @@
         </w:tc>
         <w:tc>
           <w:tcPr>
-            <w:tcW w:type="dxa" w:w="1584"/>
+            <w:tcW w:type="dxa" w:w="1631"/>
             <w:vAlign w:val="center"/>
+            <w:tcMar>
+              <w:top w:w="55" w:type="dxa"/>
+              <w:bottom w:w="55" w:type="dxa"/>
+              <w:start w:w="85" w:type="dxa"/>
+              <w:end w:w="85" w:type="dxa"/>
+            </w:tcMar>
           </w:tcPr>
           <w:p>
             <w:pPr>
-              <w:spacing w:after="0"/>
+              <w:spacing w:after="0" w:line="252" w:lineRule="auto"/>
             </w:pPr>
-            <w:r/>
             <w:r>
               <w:rPr>
-                <w:rFonts w:ascii="Microsoft YaHei" w:hAnsi="Microsoft YaHei" w:eastAsia="Microsoft YaHei"/>
+                <w:rFonts w:ascii="Microsoft YaHei" w:hAnsi="Microsoft YaHei" w:eastAsia="Microsoft YaHei" w:cs="Microsoft YaHei"/>
+                <w:color w:val="000000"/>
+              </w:rPr>
+            </w:r>
+            <w:r>
+              <w:rPr>
+                <w:rFonts w:ascii="Microsoft YaHei" w:hAnsi="Microsoft YaHei" w:eastAsia="Microsoft YaHei" w:cs="Microsoft YaHei"/>
                 <w:b w:val="0"/>
                 <w:color w:val="000000"/>
                 <w:sz w:val="16"/>
@@ -351,22 +520,33 @@
         </w:tc>
         <w:tc>
           <w:tcPr>
-            <w:tcW w:type="dxa" w:w="6408"/>
+            <w:tcW w:type="dxa" w:w="6596"/>
             <w:vAlign w:val="center"/>
+            <w:tcMar>
+              <w:top w:w="55" w:type="dxa"/>
+              <w:bottom w:w="55" w:type="dxa"/>
+              <w:start w:w="85" w:type="dxa"/>
+              <w:end w:w="85" w:type="dxa"/>
+            </w:tcMar>
           </w:tcPr>
           <w:p>
             <w:pPr>
-              <w:spacing w:after="0"/>
+              <w:spacing w:after="0" w:line="252" w:lineRule="auto"/>
             </w:pPr>
-            <w:r/>
             <w:r>
               <w:rPr>
-                <w:rFonts w:ascii="Microsoft YaHei" w:hAnsi="Microsoft YaHei" w:eastAsia="Microsoft YaHei"/>
+                <w:rFonts w:ascii="Microsoft YaHei" w:hAnsi="Microsoft YaHei" w:eastAsia="Microsoft YaHei" w:cs="Microsoft YaHei"/>
+                <w:color w:val="000000"/>
+              </w:rPr>
+            </w:r>
+            <w:r>
+              <w:rPr>
+                <w:rFonts w:ascii="Microsoft YaHei" w:hAnsi="Microsoft YaHei" w:eastAsia="Microsoft YaHei" w:cs="Microsoft YaHei"/>
                 <w:b w:val="0"/>
                 <w:color w:val="000000"/>
                 <w:sz w:val="16"/>
               </w:rPr>
-              <w:t>突变残基相对WT的结构条件对数概率变化；实验复合物优先，缺失区用AF3-only回退</w:t>
+              <w:t>突变残基相对WT的结构条件对数概率变化；实验复合物优先，缺失区用AF3单体补充视图</w:t>
             </w:r>
           </w:p>
         </w:tc>
@@ -374,17 +554,28 @@
       <w:tr>
         <w:tc>
           <w:tcPr>
-            <w:tcW w:type="dxa" w:w="1584"/>
+            <w:tcW w:type="dxa" w:w="1631"/>
             <w:vAlign w:val="center"/>
+            <w:tcMar>
+              <w:top w:w="55" w:type="dxa"/>
+              <w:bottom w:w="55" w:type="dxa"/>
+              <w:start w:w="85" w:type="dxa"/>
+              <w:end w:w="85" w:type="dxa"/>
+            </w:tcMar>
           </w:tcPr>
           <w:p>
             <w:pPr>
-              <w:spacing w:after="0"/>
+              <w:spacing w:after="0" w:line="252" w:lineRule="auto"/>
             </w:pPr>
-            <w:r/>
             <w:r>
               <w:rPr>
-                <w:rFonts w:ascii="Microsoft YaHei" w:hAnsi="Microsoft YaHei" w:eastAsia="Microsoft YaHei"/>
+                <w:rFonts w:ascii="Microsoft YaHei" w:hAnsi="Microsoft YaHei" w:eastAsia="Microsoft YaHei" w:cs="Microsoft YaHei"/>
+                <w:color w:val="000000"/>
+              </w:rPr>
+            </w:r>
+            <w:r>
+              <w:rPr>
+                <w:rFonts w:ascii="Microsoft YaHei" w:hAnsi="Microsoft YaHei" w:eastAsia="Microsoft YaHei" w:cs="Microsoft YaHei"/>
                 <w:b w:val="0"/>
                 <w:color w:val="000000"/>
                 <w:sz w:val="16"/>
@@ -395,17 +586,28 @@
         </w:tc>
         <w:tc>
           <w:tcPr>
-            <w:tcW w:type="dxa" w:w="1584"/>
+            <w:tcW w:type="dxa" w:w="1631"/>
             <w:vAlign w:val="center"/>
+            <w:tcMar>
+              <w:top w:w="55" w:type="dxa"/>
+              <w:bottom w:w="55" w:type="dxa"/>
+              <w:start w:w="85" w:type="dxa"/>
+              <w:end w:w="85" w:type="dxa"/>
+            </w:tcMar>
           </w:tcPr>
           <w:p>
             <w:pPr>
-              <w:spacing w:after="0"/>
+              <w:spacing w:after="0" w:line="252" w:lineRule="auto"/>
             </w:pPr>
-            <w:r/>
             <w:r>
               <w:rPr>
-                <w:rFonts w:ascii="Microsoft YaHei" w:hAnsi="Microsoft YaHei" w:eastAsia="Microsoft YaHei"/>
+                <w:rFonts w:ascii="Microsoft YaHei" w:hAnsi="Microsoft YaHei" w:eastAsia="Microsoft YaHei" w:cs="Microsoft YaHei"/>
+                <w:color w:val="000000"/>
+              </w:rPr>
+            </w:r>
+            <w:r>
+              <w:rPr>
+                <w:rFonts w:ascii="Microsoft YaHei" w:hAnsi="Microsoft YaHei" w:eastAsia="Microsoft YaHei" w:cs="Microsoft YaHei"/>
                 <w:b w:val="0"/>
                 <w:color w:val="000000"/>
                 <w:sz w:val="16"/>
@@ -416,17 +618,28 @@
         </w:tc>
         <w:tc>
           <w:tcPr>
-            <w:tcW w:type="dxa" w:w="6408"/>
+            <w:tcW w:type="dxa" w:w="6596"/>
             <w:vAlign w:val="center"/>
+            <w:tcMar>
+              <w:top w:w="55" w:type="dxa"/>
+              <w:bottom w:w="55" w:type="dxa"/>
+              <w:start w:w="85" w:type="dxa"/>
+              <w:end w:w="85" w:type="dxa"/>
+            </w:tcMar>
           </w:tcPr>
           <w:p>
             <w:pPr>
-              <w:spacing w:after="0"/>
+              <w:spacing w:after="0" w:line="252" w:lineRule="auto"/>
             </w:pPr>
-            <w:r/>
             <w:r>
               <w:rPr>
-                <w:rFonts w:ascii="Microsoft YaHei" w:hAnsi="Microsoft YaHei" w:eastAsia="Microsoft YaHei"/>
+                <w:rFonts w:ascii="Microsoft YaHei" w:hAnsi="Microsoft YaHei" w:eastAsia="Microsoft YaHei" w:cs="Microsoft YaHei"/>
+                <w:color w:val="000000"/>
+              </w:rPr>
+            </w:r>
+            <w:r>
+              <w:rPr>
+                <w:rFonts w:ascii="Microsoft YaHei" w:hAnsi="Microsoft YaHei" w:eastAsia="Microsoft YaHei" w:cs="Microsoft YaHei"/>
                 <w:b w:val="0"/>
                 <w:color w:val="000000"/>
                 <w:sz w:val="16"/>
@@ -442,6 +655,10 @@
         <w:pStyle w:val="Heading2"/>
       </w:pPr>
       <w:r>
+        <w:rPr>
+          <w:rFonts w:ascii="Microsoft YaHei" w:hAnsi="Microsoft YaHei" w:eastAsia="Microsoft YaHei" w:cs="Microsoft YaHei"/>
+          <w:color w:val="000000"/>
+        </w:rPr>
         <w:t>筛选逻辑</w:t>
       </w:r>
     </w:p>
@@ -452,7 +669,7 @@
       </w:pPr>
       <w:r>
         <w:rPr>
-          <w:rFonts w:ascii="Microsoft YaHei" w:hAnsi="Microsoft YaHei" w:eastAsia="Microsoft YaHei"/>
+          <w:rFonts w:ascii="Microsoft YaHei" w:hAnsi="Microsoft YaHei" w:eastAsia="Microsoft YaHei" w:cs="Microsoft YaHei"/>
           <w:color w:val="000000"/>
           <w:sz w:val="20"/>
         </w:rPr>
@@ -466,7 +683,7 @@
       </w:pPr>
       <w:r>
         <w:rPr>
-          <w:rFonts w:ascii="Microsoft YaHei" w:hAnsi="Microsoft YaHei" w:eastAsia="Microsoft YaHei"/>
+          <w:rFonts w:ascii="Microsoft YaHei" w:hAnsi="Microsoft YaHei" w:eastAsia="Microsoft YaHei" w:cs="Microsoft YaHei"/>
           <w:color w:val="000000"/>
           <w:sz w:val="20"/>
         </w:rPr>
@@ -480,7 +697,7 @@
       </w:pPr>
       <w:r>
         <w:rPr>
-          <w:rFonts w:ascii="Microsoft YaHei" w:hAnsi="Microsoft YaHei" w:eastAsia="Microsoft YaHei"/>
+          <w:rFonts w:ascii="Microsoft YaHei" w:hAnsi="Microsoft YaHei" w:eastAsia="Microsoft YaHei" w:cs="Microsoft YaHei"/>
           <w:color w:val="000000"/>
           <w:sz w:val="20"/>
         </w:rPr>
@@ -494,11 +711,11 @@
       </w:pPr>
       <w:r>
         <w:rPr>
-          <w:rFonts w:ascii="Microsoft YaHei" w:hAnsi="Microsoft YaHei" w:eastAsia="Microsoft YaHei"/>
+          <w:rFonts w:ascii="Microsoft YaHei" w:hAnsi="Microsoft YaHei" w:eastAsia="Microsoft YaHei" w:cs="Microsoft YaHei"/>
           <w:color w:val="000000"/>
           <w:sz w:val="20"/>
         </w:rPr>
-        <w:t>空心三角：AntiFold使用AF3 VHH-only回退；金色星号：稳定词探索候选。</w:t>
+        <w:t>表格顺序表示A→B→C→D→E的分层优先级；同层内部不是精确效力排名。</w:t>
       </w:r>
     </w:p>
     <w:p>
@@ -508,7 +725,21 @@
       </w:pPr>
       <w:r>
         <w:rPr>
-          <w:rFonts w:ascii="Microsoft YaHei" w:hAnsi="Microsoft YaHei" w:eastAsia="Microsoft YaHei"/>
+          <w:rFonts w:ascii="Microsoft YaHei" w:hAnsi="Microsoft YaHei" w:eastAsia="Microsoft YaHei" w:cs="Microsoft YaHei"/>
+          <w:color w:val="000000"/>
+          <w:sz w:val="20"/>
+        </w:rPr>
+        <w:t>空心三角：AntiFold使用AF3单体补充视图；金色星号：稳定词探索候选。</w:t>
+      </w:r>
+    </w:p>
+    <w:p>
+      <w:pPr>
+        <w:pStyle w:val="ListBullet"/>
+        <w:spacing w:after="60"/>
+      </w:pPr>
+      <w:r>
+        <w:rPr>
+          <w:rFonts w:ascii="Microsoft YaHei" w:hAnsi="Microsoft YaHei" w:eastAsia="Microsoft YaHei" w:cs="Microsoft YaHei"/>
           <w:color w:val="000000"/>
           <w:sz w:val="20"/>
         </w:rPr>
@@ -520,13 +751,17 @@
         <w:pStyle w:val="Heading2"/>
       </w:pPr>
       <w:r>
+        <w:rPr>
+          <w:rFonts w:ascii="Microsoft YaHei" w:hAnsi="Microsoft YaHei" w:eastAsia="Microsoft YaHei" w:cs="Microsoft YaHei"/>
+          <w:color w:val="000000"/>
+        </w:rPr>
         <w:t>实验判读</w:t>
       </w:r>
     </w:p>
     <w:p>
       <w:r>
         <w:rPr>
-          <w:rFonts w:ascii="Microsoft YaHei" w:hAnsi="Microsoft YaHei" w:eastAsia="Microsoft YaHei"/>
+          <w:rFonts w:ascii="Microsoft YaHei" w:hAnsi="Microsoft YaHei" w:eastAsia="Microsoft YaHei" w:cs="Microsoft YaHei"/>
           <w:color w:val="000000"/>
           <w:sz w:val="18"/>
         </w:rPr>
@@ -534,6 +769,8 @@
       </w:r>
     </w:p>
     <w:sectPr>
+      <w:headerReference w:type="default" r:id="rId9"/>
+      <w:footerReference w:type="default" r:id="rId10"/>
       <w:pgSz w:w="12240" w:h="15840"/>
       <w:pgMar w:top="709" w:right="1191" w:bottom="680" w:left="1191" w:header="720" w:footer="720" w:gutter="0"/>
       <w:cols w:space="720"/>
@@ -541,6 +778,26 @@
     </w:sectPr>
   </w:body>
 </w:document>
+</file>
+
+<file path=word/footer1.xml><?xml version="1.0" encoding="utf-8"?>
+<w:ftr xmlns:m="http://schemas.openxmlformats.org/officeDocument/2006/math" xmlns:mc="http://schemas.openxmlformats.org/markup-compatibility/2006" xmlns:mo="http://schemas.microsoft.com/office/mac/office/2008/main" xmlns:mv="urn:schemas-microsoft-com:mac:vml" xmlns:o="urn:schemas-microsoft-com:office:office" xmlns:r="http://schemas.openxmlformats.org/officeDocument/2006/relationships" xmlns:v="urn:schemas-microsoft-com:vml" xmlns:w10="urn:schemas-microsoft-com:office:word" xmlns:w14="http://schemas.microsoft.com/office/word/2010/wordml" xmlns:w="http://schemas.openxmlformats.org/wordprocessingml/2006/main" xmlns:wne="http://schemas.microsoft.com/office/word/2006/wordml" xmlns:wp14="http://schemas.microsoft.com/office/word/2010/wordprocessingDrawing" xmlns:wp="http://schemas.openxmlformats.org/drawingml/2006/wordprocessingDrawing" xmlns:wpc="http://schemas.microsoft.com/office/word/2010/wordprocessingCanvas" xmlns:wpg="http://schemas.microsoft.com/office/word/2010/wordprocessingGroup" xmlns:wpi="http://schemas.microsoft.com/office/word/2010/wordprocessingInk" xmlns:wps="http://schemas.microsoft.com/office/word/2010/wordprocessingShape" mc:Ignorable="w14 wp14">
+  <w:p>
+    <w:pPr>
+      <w:pStyle w:val="Footer"/>
+    </w:pPr>
+  </w:p>
+</w:ftr>
+</file>
+
+<file path=word/header1.xml><?xml version="1.0" encoding="utf-8"?>
+<w:hdr xmlns:m="http://schemas.openxmlformats.org/officeDocument/2006/math" xmlns:mc="http://schemas.openxmlformats.org/markup-compatibility/2006" xmlns:mo="http://schemas.microsoft.com/office/mac/office/2008/main" xmlns:mv="urn:schemas-microsoft-com:mac:vml" xmlns:o="urn:schemas-microsoft-com:office:office" xmlns:r="http://schemas.openxmlformats.org/officeDocument/2006/relationships" xmlns:v="urn:schemas-microsoft-com:vml" xmlns:w10="urn:schemas-microsoft-com:office:word" xmlns:w14="http://schemas.microsoft.com/office/word/2010/wordml" xmlns:w="http://schemas.openxmlformats.org/wordprocessingml/2006/main" xmlns:wne="http://schemas.microsoft.com/office/word/2006/wordml" xmlns:wp14="http://schemas.microsoft.com/office/word/2010/wordprocessingDrawing" xmlns:wp="http://schemas.openxmlformats.org/drawingml/2006/wordprocessingDrawing" xmlns:wpc="http://schemas.microsoft.com/office/word/2010/wordprocessingCanvas" xmlns:wpg="http://schemas.microsoft.com/office/word/2010/wordprocessingGroup" xmlns:wpi="http://schemas.microsoft.com/office/word/2010/wordprocessingInk" xmlns:wps="http://schemas.microsoft.com/office/word/2010/wordprocessingShape" mc:Ignorable="w14 wp14">
+  <w:p>
+    <w:pPr>
+      <w:pStyle w:val="Header"/>
+    </w:pPr>
+  </w:p>
+</w:hdr>
 </file>
 
 <file path=word/numbering.xml><?xml version="1.0" encoding="utf-8"?>
@@ -910,7 +1167,7 @@
       <w:spacing w:line="300" w:lineRule="auto" w:after="100"/>
     </w:pPr>
     <w:rPr>
-      <w:rFonts w:ascii="Microsoft YaHei" w:hAnsi="Microsoft YaHei" w:eastAsia="Microsoft YaHei"/>
+      <w:rFonts w:ascii="Microsoft YaHei" w:hAnsi="Microsoft YaHei" w:eastAsia="Microsoft YaHei" w:cs="Microsoft YaHei"/>
       <w:b w:val="0"/>
       <w:color w:val="000000"/>
       <w:sz w:val="21"/>
@@ -975,7 +1232,7 @@
       <w:outlineLvl w:val="0"/>
     </w:pPr>
     <w:rPr>
-      <w:rFonts w:asciiTheme="majorHAnsi" w:eastAsiaTheme="majorEastAsia" w:hAnsiTheme="majorHAnsi" w:cstheme="majorBidi" w:ascii="Microsoft YaHei" w:hAnsi="Microsoft YaHei" w:eastAsia="Microsoft YaHei"/>
+      <w:rFonts w:ascii="Microsoft YaHei" w:hAnsi="Microsoft YaHei" w:eastAsia="Microsoft YaHei" w:cs="Microsoft YaHei"/>
       <w:b/>
       <w:bCs/>
       <w:color w:val="000000"/>
@@ -999,7 +1256,7 @@
       <w:outlineLvl w:val="1"/>
     </w:pPr>
     <w:rPr>
-      <w:rFonts w:asciiTheme="majorHAnsi" w:eastAsiaTheme="majorEastAsia" w:hAnsiTheme="majorHAnsi" w:cstheme="majorBidi" w:ascii="Microsoft YaHei" w:hAnsi="Microsoft YaHei" w:eastAsia="Microsoft YaHei"/>
+      <w:rFonts w:ascii="Microsoft YaHei" w:hAnsi="Microsoft YaHei" w:eastAsia="Microsoft YaHei" w:cs="Microsoft YaHei"/>
       <w:b/>
       <w:bCs/>
       <w:color w:val="000000"/>
@@ -1264,7 +1521,7 @@
       <w:contextualSpacing/>
     </w:pPr>
     <w:rPr>
-      <w:rFonts w:asciiTheme="majorHAnsi" w:eastAsiaTheme="majorEastAsia" w:hAnsiTheme="majorHAnsi" w:cstheme="majorBidi" w:ascii="Microsoft YaHei" w:hAnsi="Microsoft YaHei" w:eastAsia="Microsoft YaHei"/>
+      <w:rFonts w:ascii="Microsoft YaHei" w:hAnsi="Microsoft YaHei" w:eastAsia="Microsoft YaHei" w:cs="Microsoft YaHei"/>
       <w:b/>
       <w:color w:val="000000"/>
       <w:spacing w:val="5"/>
@@ -1302,7 +1559,7 @@
       </w:numPr>
     </w:pPr>
     <w:rPr>
-      <w:rFonts w:asciiTheme="majorHAnsi" w:eastAsiaTheme="majorEastAsia" w:hAnsiTheme="majorHAnsi" w:cstheme="majorBidi" w:ascii="Microsoft YaHei" w:hAnsi="Microsoft YaHei" w:eastAsia="Microsoft YaHei"/>
+      <w:rFonts w:ascii="Microsoft YaHei" w:hAnsi="Microsoft YaHei" w:eastAsia="Microsoft YaHei" w:cs="Microsoft YaHei"/>
       <w:b w:val="0"/>
       <w:i/>
       <w:iCs/>
@@ -1708,7 +1965,7 @@
       <w:spacing w:line="240" w:lineRule="auto"/>
     </w:pPr>
     <w:rPr>
-      <w:rFonts w:ascii="Microsoft YaHei" w:hAnsi="Microsoft YaHei" w:eastAsia="Microsoft YaHei"/>
+      <w:rFonts w:ascii="Microsoft YaHei" w:hAnsi="Microsoft YaHei" w:eastAsia="Microsoft YaHei" w:cs="Microsoft YaHei"/>
       <w:b w:val="0"/>
       <w:bCs/>
       <w:color w:val="000000"/>

</xml_diff>